<commit_message>
ass 4 done! + adv learner project tree done!
</commit_message>
<xml_diff>
--- a/Assignments/Assignment 4-Apurv.docx
+++ b/Assignments/Assignment 4-Apurv.docx
@@ -660,13 +660,7 @@
         <w:rPr>
           <w:rFonts w:ascii="Times New Roman" w:hAnsi="Times New Roman" w:cs="Times New Roman"/>
         </w:rPr>
-        <w:t xml:space="preserve">Time Complexity = O(V+E) … </w:t>
-      </w:r>
-      <w:r>
-        <w:rPr>
-          <w:rFonts w:ascii="Times New Roman" w:hAnsi="Times New Roman" w:cs="Times New Roman"/>
-        </w:rPr>
-        <w:t>V is no. of vertices and E is no. of edges</w:t>
+        <w:t>Time Complexity = O(V+E) … V is no. of vertices and E is no. of edges</w:t>
       </w:r>
     </w:p>
     <w:p>
@@ -2327,76 +2321,52 @@
         <w:rPr>
           <w:rFonts w:ascii="Times New Roman" w:hAnsi="Times New Roman" w:cs="Times New Roman"/>
         </w:rPr>
-        <w:t>Step 1: Accept two user indices u and v.</w:t>
-      </w:r>
-      <w:r>
-        <w:rPr>
-          <w:rFonts w:ascii="Times New Roman" w:hAnsi="Times New Roman" w:cs="Times New Roman"/>
-        </w:rPr>
-        <w:t xml:space="preserve"> </w:t>
-      </w:r>
-    </w:p>
-    <w:p>
-      <w:pPr>
-        <w:spacing w:after="0" w:line="240" w:lineRule="auto"/>
-        <w:jc w:val="both"/>
-        <w:rPr>
-          <w:rFonts w:ascii="Times New Roman" w:hAnsi="Times New Roman" w:cs="Times New Roman"/>
-        </w:rPr>
-      </w:pPr>
-      <w:r>
-        <w:rPr>
-          <w:rFonts w:ascii="Times New Roman" w:hAnsi="Times New Roman" w:cs="Times New Roman"/>
-        </w:rPr>
-        <w:t xml:space="preserve">      </w:t>
-      </w:r>
-      <w:r>
-        <w:rPr>
-          <w:rFonts w:ascii="Times New Roman" w:hAnsi="Times New Roman" w:cs="Times New Roman"/>
-        </w:rPr>
-        <w:t>Step 2: Insert v into adjacency list of u.</w:t>
-      </w:r>
-    </w:p>
-    <w:p>
-      <w:pPr>
-        <w:spacing w:after="0" w:line="240" w:lineRule="auto"/>
-        <w:jc w:val="both"/>
-        <w:rPr>
-          <w:rFonts w:ascii="Times New Roman" w:hAnsi="Times New Roman" w:cs="Times New Roman"/>
-        </w:rPr>
-      </w:pPr>
-      <w:r>
-        <w:rPr>
-          <w:rFonts w:ascii="Times New Roman" w:hAnsi="Times New Roman" w:cs="Times New Roman"/>
-        </w:rPr>
-        <w:t xml:space="preserve">      </w:t>
-      </w:r>
-      <w:r>
-        <w:rPr>
-          <w:rFonts w:ascii="Times New Roman" w:hAnsi="Times New Roman" w:cs="Times New Roman"/>
-        </w:rPr>
-        <w:t>Step 3: Insert u into adjacency list of v.</w:t>
-      </w:r>
-    </w:p>
-    <w:p>
-      <w:pPr>
-        <w:spacing w:after="0" w:line="240" w:lineRule="auto"/>
-        <w:jc w:val="both"/>
-        <w:rPr>
-          <w:rFonts w:ascii="Times New Roman" w:hAnsi="Times New Roman" w:cs="Times New Roman"/>
-        </w:rPr>
-      </w:pPr>
-      <w:r>
-        <w:rPr>
-          <w:rFonts w:ascii="Times New Roman" w:hAnsi="Times New Roman" w:cs="Times New Roman"/>
-        </w:rPr>
-        <w:t xml:space="preserve">      </w:t>
-      </w:r>
-      <w:r>
-        <w:rPr>
-          <w:rFonts w:ascii="Times New Roman" w:hAnsi="Times New Roman" w:cs="Times New Roman"/>
-        </w:rPr>
-        <w:t>Step 4: End.</w:t>
+        <w:t xml:space="preserve">Step 1: Accept two user indices u and v. </w:t>
+      </w:r>
+    </w:p>
+    <w:p>
+      <w:pPr>
+        <w:spacing w:after="0" w:line="240" w:lineRule="auto"/>
+        <w:jc w:val="both"/>
+        <w:rPr>
+          <w:rFonts w:ascii="Times New Roman" w:hAnsi="Times New Roman" w:cs="Times New Roman"/>
+        </w:rPr>
+      </w:pPr>
+      <w:r>
+        <w:rPr>
+          <w:rFonts w:ascii="Times New Roman" w:hAnsi="Times New Roman" w:cs="Times New Roman"/>
+        </w:rPr>
+        <w:t xml:space="preserve">      Step 2: Insert v into adjacency list of u.</w:t>
+      </w:r>
+    </w:p>
+    <w:p>
+      <w:pPr>
+        <w:spacing w:after="0" w:line="240" w:lineRule="auto"/>
+        <w:jc w:val="both"/>
+        <w:rPr>
+          <w:rFonts w:ascii="Times New Roman" w:hAnsi="Times New Roman" w:cs="Times New Roman"/>
+        </w:rPr>
+      </w:pPr>
+      <w:r>
+        <w:rPr>
+          <w:rFonts w:ascii="Times New Roman" w:hAnsi="Times New Roman" w:cs="Times New Roman"/>
+        </w:rPr>
+        <w:t xml:space="preserve">      Step 3: Insert u into adjacency list of v.</w:t>
+      </w:r>
+    </w:p>
+    <w:p>
+      <w:pPr>
+        <w:spacing w:after="0" w:line="240" w:lineRule="auto"/>
+        <w:jc w:val="both"/>
+        <w:rPr>
+          <w:rFonts w:ascii="Times New Roman" w:hAnsi="Times New Roman" w:cs="Times New Roman"/>
+        </w:rPr>
+      </w:pPr>
+      <w:r>
+        <w:rPr>
+          <w:rFonts w:ascii="Times New Roman" w:hAnsi="Times New Roman" w:cs="Times New Roman"/>
+        </w:rPr>
+        <w:t xml:space="preserve">      Step 4: End.</w:t>
       </w:r>
     </w:p>
     <w:p>
@@ -2478,13 +2448,7 @@
         <w:rPr>
           <w:rFonts w:ascii="Times New Roman" w:hAnsi="Times New Roman" w:cs="Times New Roman"/>
         </w:rPr>
-        <w:t xml:space="preserve">      </w:t>
-      </w:r>
-      <w:r>
-        <w:rPr>
-          <w:rFonts w:ascii="Times New Roman" w:hAnsi="Times New Roman" w:cs="Times New Roman"/>
-        </w:rPr>
-        <w:t xml:space="preserve">Step 2: Initialize </w:t>
+        <w:t xml:space="preserve">      Step 2: Initialize </w:t>
       </w:r>
       <w:proofErr w:type="spellStart"/>
       <w:r>
@@ -2513,34 +2477,22 @@
         <w:rPr>
           <w:rFonts w:ascii="Times New Roman" w:hAnsi="Times New Roman" w:cs="Times New Roman"/>
         </w:rPr>
-        <w:t xml:space="preserve">      </w:t>
-      </w:r>
-      <w:r>
-        <w:rPr>
-          <w:rFonts w:ascii="Times New Roman" w:hAnsi="Times New Roman" w:cs="Times New Roman"/>
-        </w:rPr>
-        <w:t>Step 3: Traverse all users.</w:t>
-      </w:r>
-    </w:p>
-    <w:p>
-      <w:pPr>
-        <w:spacing w:after="0" w:line="240" w:lineRule="auto"/>
-        <w:jc w:val="both"/>
-        <w:rPr>
-          <w:rFonts w:ascii="Times New Roman" w:hAnsi="Times New Roman" w:cs="Times New Roman"/>
-        </w:rPr>
-      </w:pPr>
-      <w:r>
-        <w:rPr>
-          <w:rFonts w:ascii="Times New Roman" w:hAnsi="Times New Roman" w:cs="Times New Roman"/>
-        </w:rPr>
-        <w:t xml:space="preserve">      </w:t>
-      </w:r>
-      <w:r>
-        <w:rPr>
-          <w:rFonts w:ascii="Times New Roman" w:hAnsi="Times New Roman" w:cs="Times New Roman"/>
-        </w:rPr>
-        <w:t xml:space="preserve">Step 4: Compare adjacency list size with </w:t>
+        <w:t xml:space="preserve">      Step 3: Traverse all users.</w:t>
+      </w:r>
+    </w:p>
+    <w:p>
+      <w:pPr>
+        <w:spacing w:after="0" w:line="240" w:lineRule="auto"/>
+        <w:jc w:val="both"/>
+        <w:rPr>
+          <w:rFonts w:ascii="Times New Roman" w:hAnsi="Times New Roman" w:cs="Times New Roman"/>
+        </w:rPr>
+      </w:pPr>
+      <w:r>
+        <w:rPr>
+          <w:rFonts w:ascii="Times New Roman" w:hAnsi="Times New Roman" w:cs="Times New Roman"/>
+        </w:rPr>
+        <w:t xml:space="preserve">      Step 4: Compare adjacency list size with </w:t>
       </w:r>
       <w:proofErr w:type="spellStart"/>
       <w:r>
@@ -2569,13 +2521,7 @@
         <w:rPr>
           <w:rFonts w:ascii="Times New Roman" w:hAnsi="Times New Roman" w:cs="Times New Roman"/>
         </w:rPr>
-        <w:t xml:space="preserve">      </w:t>
-      </w:r>
-      <w:r>
-        <w:rPr>
-          <w:rFonts w:ascii="Times New Roman" w:hAnsi="Times New Roman" w:cs="Times New Roman"/>
-        </w:rPr>
-        <w:t xml:space="preserve">Step 5: Update </w:t>
+        <w:t xml:space="preserve">      Step 5: Update </w:t>
       </w:r>
       <w:proofErr w:type="spellStart"/>
       <w:r>
@@ -2618,34 +2564,22 @@
         <w:rPr>
           <w:rFonts w:ascii="Times New Roman" w:hAnsi="Times New Roman" w:cs="Times New Roman"/>
         </w:rPr>
-        <w:t xml:space="preserve">      </w:t>
-      </w:r>
-      <w:r>
-        <w:rPr>
-          <w:rFonts w:ascii="Times New Roman" w:hAnsi="Times New Roman" w:cs="Times New Roman"/>
-        </w:rPr>
-        <w:t>Step 6: Print user with maximum friends.</w:t>
-      </w:r>
-    </w:p>
-    <w:p>
-      <w:pPr>
-        <w:spacing w:after="0" w:line="240" w:lineRule="auto"/>
-        <w:jc w:val="both"/>
-        <w:rPr>
-          <w:rFonts w:ascii="Times New Roman" w:hAnsi="Times New Roman" w:cs="Times New Roman"/>
-        </w:rPr>
-      </w:pPr>
-      <w:r>
-        <w:rPr>
-          <w:rFonts w:ascii="Times New Roman" w:hAnsi="Times New Roman" w:cs="Times New Roman"/>
-        </w:rPr>
-        <w:t xml:space="preserve">      </w:t>
-      </w:r>
-      <w:r>
-        <w:rPr>
-          <w:rFonts w:ascii="Times New Roman" w:hAnsi="Times New Roman" w:cs="Times New Roman"/>
-        </w:rPr>
-        <w:t>Step 7: End.</w:t>
+        <w:t xml:space="preserve">      Step 6: Print user with maximum friends.</w:t>
+      </w:r>
+    </w:p>
+    <w:p>
+      <w:pPr>
+        <w:spacing w:after="0" w:line="240" w:lineRule="auto"/>
+        <w:jc w:val="both"/>
+        <w:rPr>
+          <w:rFonts w:ascii="Times New Roman" w:hAnsi="Times New Roman" w:cs="Times New Roman"/>
+        </w:rPr>
+      </w:pPr>
+      <w:r>
+        <w:rPr>
+          <w:rFonts w:ascii="Times New Roman" w:hAnsi="Times New Roman" w:cs="Times New Roman"/>
+        </w:rPr>
+        <w:t xml:space="preserve">      Step 7: End.</w:t>
       </w:r>
     </w:p>
     <w:p>
@@ -3069,25 +3003,7 @@
         <w:rPr>
           <w:rFonts w:ascii="Times New Roman" w:hAnsi="Times New Roman" w:cs="Times New Roman"/>
         </w:rPr>
-        <w:t xml:space="preserve">   </w:t>
-      </w:r>
-      <w:r>
-        <w:rPr>
-          <w:rFonts w:ascii="Times New Roman" w:hAnsi="Times New Roman" w:cs="Times New Roman"/>
-        </w:rPr>
-        <w:t xml:space="preserve">  </w:t>
-      </w:r>
-      <w:r>
-        <w:rPr>
-          <w:rFonts w:ascii="Times New Roman" w:hAnsi="Times New Roman" w:cs="Times New Roman"/>
-        </w:rPr>
-        <w:t xml:space="preserve"> </w:t>
-      </w:r>
-      <w:r>
-        <w:rPr>
-          <w:rFonts w:ascii="Times New Roman" w:hAnsi="Times New Roman" w:cs="Times New Roman"/>
-        </w:rPr>
-        <w:t xml:space="preserve">Step 2: Initialize </w:t>
+        <w:t xml:space="preserve">      Step 2: Initialize </w:t>
       </w:r>
       <w:proofErr w:type="spellStart"/>
       <w:r>
@@ -3116,91 +3032,37 @@
         <w:rPr>
           <w:rFonts w:ascii="Times New Roman" w:hAnsi="Times New Roman" w:cs="Times New Roman"/>
         </w:rPr>
-        <w:t xml:space="preserve">   </w:t>
-      </w:r>
-      <w:r>
-        <w:rPr>
-          <w:rFonts w:ascii="Times New Roman" w:hAnsi="Times New Roman" w:cs="Times New Roman"/>
-        </w:rPr>
-        <w:t xml:space="preserve">  </w:t>
-      </w:r>
-      <w:r>
-        <w:rPr>
-          <w:rFonts w:ascii="Times New Roman" w:hAnsi="Times New Roman" w:cs="Times New Roman"/>
-        </w:rPr>
-        <w:t xml:space="preserve"> </w:t>
-      </w:r>
-      <w:r>
-        <w:rPr>
-          <w:rFonts w:ascii="Times New Roman" w:hAnsi="Times New Roman" w:cs="Times New Roman"/>
-        </w:rPr>
-        <w:t>Step 3: Traverse all users.</w:t>
-      </w:r>
-    </w:p>
-    <w:p>
-      <w:pPr>
-        <w:spacing w:after="0" w:line="240" w:lineRule="auto"/>
-        <w:jc w:val="both"/>
-        <w:rPr>
-          <w:rFonts w:ascii="Times New Roman" w:hAnsi="Times New Roman" w:cs="Times New Roman"/>
-        </w:rPr>
-      </w:pPr>
-      <w:r>
-        <w:rPr>
-          <w:rFonts w:ascii="Times New Roman" w:hAnsi="Times New Roman" w:cs="Times New Roman"/>
-        </w:rPr>
-        <w:t xml:space="preserve">   </w:t>
-      </w:r>
-      <w:r>
-        <w:rPr>
-          <w:rFonts w:ascii="Times New Roman" w:hAnsi="Times New Roman" w:cs="Times New Roman"/>
-        </w:rPr>
-        <w:t xml:space="preserve">  </w:t>
-      </w:r>
-      <w:r>
-        <w:rPr>
-          <w:rFonts w:ascii="Times New Roman" w:hAnsi="Times New Roman" w:cs="Times New Roman"/>
-        </w:rPr>
-        <w:t xml:space="preserve"> </w:t>
-      </w:r>
-      <w:r>
-        <w:rPr>
-          <w:rFonts w:ascii="Times New Roman" w:hAnsi="Times New Roman" w:cs="Times New Roman"/>
-        </w:rPr>
-        <w:t>Step 4: Compare comment count.</w:t>
-      </w:r>
-    </w:p>
-    <w:p>
-      <w:pPr>
-        <w:spacing w:after="0" w:line="240" w:lineRule="auto"/>
-        <w:jc w:val="both"/>
-        <w:rPr>
-          <w:rFonts w:ascii="Times New Roman" w:hAnsi="Times New Roman" w:cs="Times New Roman"/>
-        </w:rPr>
-      </w:pPr>
-      <w:r>
-        <w:rPr>
-          <w:rFonts w:ascii="Times New Roman" w:hAnsi="Times New Roman" w:cs="Times New Roman"/>
-        </w:rPr>
-        <w:t xml:space="preserve">   </w:t>
-      </w:r>
-      <w:r>
-        <w:rPr>
-          <w:rFonts w:ascii="Times New Roman" w:hAnsi="Times New Roman" w:cs="Times New Roman"/>
-        </w:rPr>
-        <w:t xml:space="preserve">  </w:t>
-      </w:r>
-      <w:r>
-        <w:rPr>
-          <w:rFonts w:ascii="Times New Roman" w:hAnsi="Times New Roman" w:cs="Times New Roman"/>
-        </w:rPr>
-        <w:t xml:space="preserve"> </w:t>
-      </w:r>
-      <w:r>
-        <w:rPr>
-          <w:rFonts w:ascii="Times New Roman" w:hAnsi="Times New Roman" w:cs="Times New Roman"/>
-        </w:rPr>
-        <w:t xml:space="preserve">Step 5: Update </w:t>
+        <w:t xml:space="preserve">      Step 3: Traverse all users.</w:t>
+      </w:r>
+    </w:p>
+    <w:p>
+      <w:pPr>
+        <w:spacing w:after="0" w:line="240" w:lineRule="auto"/>
+        <w:jc w:val="both"/>
+        <w:rPr>
+          <w:rFonts w:ascii="Times New Roman" w:hAnsi="Times New Roman" w:cs="Times New Roman"/>
+        </w:rPr>
+      </w:pPr>
+      <w:r>
+        <w:rPr>
+          <w:rFonts w:ascii="Times New Roman" w:hAnsi="Times New Roman" w:cs="Times New Roman"/>
+        </w:rPr>
+        <w:t xml:space="preserve">      Step 4: Compare comment count.</w:t>
+      </w:r>
+    </w:p>
+    <w:p>
+      <w:pPr>
+        <w:spacing w:after="0" w:line="240" w:lineRule="auto"/>
+        <w:jc w:val="both"/>
+        <w:rPr>
+          <w:rFonts w:ascii="Times New Roman" w:hAnsi="Times New Roman" w:cs="Times New Roman"/>
+        </w:rPr>
+      </w:pPr>
+      <w:r>
+        <w:rPr>
+          <w:rFonts w:ascii="Times New Roman" w:hAnsi="Times New Roman" w:cs="Times New Roman"/>
+        </w:rPr>
+        <w:t xml:space="preserve">      Step 5: Update </w:t>
       </w:r>
       <w:proofErr w:type="spellStart"/>
       <w:r>
@@ -3229,46 +3091,22 @@
         <w:rPr>
           <w:rFonts w:ascii="Times New Roman" w:hAnsi="Times New Roman" w:cs="Times New Roman"/>
         </w:rPr>
-        <w:t xml:space="preserve">   </w:t>
-      </w:r>
-      <w:r>
-        <w:rPr>
-          <w:rFonts w:ascii="Times New Roman" w:hAnsi="Times New Roman" w:cs="Times New Roman"/>
-        </w:rPr>
-        <w:t xml:space="preserve">  </w:t>
-      </w:r>
-      <w:r>
-        <w:rPr>
-          <w:rFonts w:ascii="Times New Roman" w:hAnsi="Times New Roman" w:cs="Times New Roman"/>
-        </w:rPr>
-        <w:t xml:space="preserve"> </w:t>
-      </w:r>
-      <w:r>
-        <w:rPr>
-          <w:rFonts w:ascii="Times New Roman" w:hAnsi="Times New Roman" w:cs="Times New Roman"/>
-        </w:rPr>
-        <w:t>Step 6: Print user with maximum comments.</w:t>
-      </w:r>
-    </w:p>
-    <w:p>
-      <w:pPr>
-        <w:spacing w:after="0" w:line="240" w:lineRule="auto"/>
-        <w:jc w:val="both"/>
-        <w:rPr>
-          <w:rFonts w:ascii="Times New Roman" w:hAnsi="Times New Roman" w:cs="Times New Roman"/>
-        </w:rPr>
-      </w:pPr>
-      <w:r>
-        <w:rPr>
-          <w:rFonts w:ascii="Times New Roman" w:hAnsi="Times New Roman" w:cs="Times New Roman"/>
-        </w:rPr>
-        <w:t xml:space="preserve">      </w:t>
-      </w:r>
-      <w:r>
-        <w:rPr>
-          <w:rFonts w:ascii="Times New Roman" w:hAnsi="Times New Roman" w:cs="Times New Roman"/>
-        </w:rPr>
-        <w:t>Step 7: End.</w:t>
+        <w:t xml:space="preserve">      Step 6: Print user with maximum comments.</w:t>
+      </w:r>
+    </w:p>
+    <w:p>
+      <w:pPr>
+        <w:spacing w:after="0" w:line="240" w:lineRule="auto"/>
+        <w:jc w:val="both"/>
+        <w:rPr>
+          <w:rFonts w:ascii="Times New Roman" w:hAnsi="Times New Roman" w:cs="Times New Roman"/>
+        </w:rPr>
+      </w:pPr>
+      <w:r>
+        <w:rPr>
+          <w:rFonts w:ascii="Times New Roman" w:hAnsi="Times New Roman" w:cs="Times New Roman"/>
+        </w:rPr>
+        <w:t xml:space="preserve">      Step 7: End.</w:t>
       </w:r>
     </w:p>
     <w:p>
@@ -3752,9 +3590,9 @@
           <w:noProof/>
         </w:rPr>
         <w:drawing>
-          <wp:inline distT="0" distB="0" distL="0" distR="0" wp14:anchorId="6637C23E" wp14:editId="719C3ACD">
-            <wp:extent cx="1164659" cy="2857500"/>
-            <wp:effectExtent l="19050" t="19050" r="16510" b="19050"/>
+          <wp:inline distT="0" distB="0" distL="0" distR="0" wp14:anchorId="6637C23E" wp14:editId="0E71593C">
+            <wp:extent cx="1166526" cy="2861991"/>
+            <wp:effectExtent l="19050" t="19050" r="14605" b="14605"/>
             <wp:docPr id="1097523913" name="Picture 3"/>
             <wp:cNvGraphicFramePr>
               <a:graphicFrameLocks xmlns:a="http://schemas.openxmlformats.org/drawingml/2006/main" noChangeAspect="1"/>
@@ -3763,7 +3601,7 @@
               <a:graphicData uri="http://schemas.openxmlformats.org/drawingml/2006/picture">
                 <pic:pic xmlns:pic="http://schemas.openxmlformats.org/drawingml/2006/picture">
                   <pic:nvPicPr>
-                    <pic:cNvPr id="1097523913" name="Picture 1097523913"/>
+                    <pic:cNvPr id="1097523913" name="Picture 3"/>
                     <pic:cNvPicPr/>
                   </pic:nvPicPr>
                   <pic:blipFill>
@@ -3781,7 +3619,7 @@
                   <pic:spPr>
                     <a:xfrm>
                       <a:off x="0" y="0"/>
-                      <a:ext cx="1166526" cy="2862080"/>
+                      <a:ext cx="1166526" cy="2861991"/>
                     </a:xfrm>
                     <a:prstGeom prst="rect">
                       <a:avLst/>
@@ -3835,10 +3673,137 @@
           <w:iCs/>
           <w:noProof/>
         </w:rPr>
+        <w:drawing>
+          <wp:anchor distT="0" distB="0" distL="114300" distR="114300" simplePos="0" relativeHeight="251660288" behindDoc="0" locked="0" layoutInCell="1" allowOverlap="1" wp14:anchorId="51D3154C" wp14:editId="10E0783C">
+            <wp:simplePos x="0" y="0"/>
+            <wp:positionH relativeFrom="margin">
+              <wp:posOffset>4267835</wp:posOffset>
+            </wp:positionH>
+            <wp:positionV relativeFrom="margin">
+              <wp:posOffset>19050</wp:posOffset>
+            </wp:positionV>
+            <wp:extent cx="1266825" cy="4541520"/>
+            <wp:effectExtent l="19050" t="19050" r="28575" b="11430"/>
+            <wp:wrapSquare wrapText="bothSides"/>
+            <wp:docPr id="294443283" name="Picture 7"/>
+            <wp:cNvGraphicFramePr>
+              <a:graphicFrameLocks xmlns:a="http://schemas.openxmlformats.org/drawingml/2006/main" noChangeAspect="1"/>
+            </wp:cNvGraphicFramePr>
+            <a:graphic xmlns:a="http://schemas.openxmlformats.org/drawingml/2006/main">
+              <a:graphicData uri="http://schemas.openxmlformats.org/drawingml/2006/picture">
+                <pic:pic xmlns:pic="http://schemas.openxmlformats.org/drawingml/2006/picture">
+                  <pic:nvPicPr>
+                    <pic:cNvPr id="294443283" name="Picture 7"/>
+                    <pic:cNvPicPr/>
+                  </pic:nvPicPr>
+                  <pic:blipFill>
+                    <a:blip r:embed="rId8" cstate="print">
+                      <a:extLst>
+                        <a:ext uri="{28A0092B-C50C-407E-A947-70E740481C1C}">
+                          <a14:useLocalDpi xmlns:a14="http://schemas.microsoft.com/office/drawing/2010/main" val="0"/>
+                        </a:ext>
+                      </a:extLst>
+                    </a:blip>
+                    <a:stretch>
+                      <a:fillRect/>
+                    </a:stretch>
+                  </pic:blipFill>
+                  <pic:spPr>
+                    <a:xfrm>
+                      <a:off x="0" y="0"/>
+                      <a:ext cx="1266825" cy="4541520"/>
+                    </a:xfrm>
+                    <a:prstGeom prst="rect">
+                      <a:avLst/>
+                    </a:prstGeom>
+                    <a:ln>
+                      <a:solidFill>
+                        <a:schemeClr val="tx1"/>
+                      </a:solidFill>
+                    </a:ln>
+                  </pic:spPr>
+                </pic:pic>
+              </a:graphicData>
+            </a:graphic>
+            <wp14:sizeRelH relativeFrom="margin">
+              <wp14:pctWidth>0</wp14:pctWidth>
+            </wp14:sizeRelH>
+          </wp:anchor>
+        </w:drawing>
+      </w:r>
+      <w:r>
+        <w:rPr>
+          <w:rFonts w:ascii="Times New Roman" w:hAnsi="Times New Roman" w:cs="Times New Roman"/>
+          <w:i/>
+          <w:iCs/>
+          <w:noProof/>
+        </w:rPr>
+        <w:drawing>
+          <wp:anchor distT="0" distB="0" distL="114300" distR="114300" simplePos="0" relativeHeight="251658240" behindDoc="0" locked="0" layoutInCell="1" allowOverlap="1" wp14:anchorId="774C61BA" wp14:editId="0D061E9E">
+            <wp:simplePos x="0" y="0"/>
+            <wp:positionH relativeFrom="margin">
+              <wp:align>center</wp:align>
+            </wp:positionH>
+            <wp:positionV relativeFrom="margin">
+              <wp:posOffset>20424</wp:posOffset>
+            </wp:positionV>
+            <wp:extent cx="1193165" cy="3047365"/>
+            <wp:effectExtent l="19050" t="19050" r="26035" b="19685"/>
+            <wp:wrapSquare wrapText="bothSides"/>
+            <wp:docPr id="1855150672" name="Picture 5"/>
+            <wp:cNvGraphicFramePr>
+              <a:graphicFrameLocks xmlns:a="http://schemas.openxmlformats.org/drawingml/2006/main" noChangeAspect="1"/>
+            </wp:cNvGraphicFramePr>
+            <a:graphic xmlns:a="http://schemas.openxmlformats.org/drawingml/2006/main">
+              <a:graphicData uri="http://schemas.openxmlformats.org/drawingml/2006/picture">
+                <pic:pic xmlns:pic="http://schemas.openxmlformats.org/drawingml/2006/picture">
+                  <pic:nvPicPr>
+                    <pic:cNvPr id="1855150672" name="Picture 5"/>
+                    <pic:cNvPicPr/>
+                  </pic:nvPicPr>
+                  <pic:blipFill>
+                    <a:blip r:embed="rId9">
+                      <a:extLst>
+                        <a:ext uri="{28A0092B-C50C-407E-A947-70E740481C1C}">
+                          <a14:useLocalDpi xmlns:a14="http://schemas.microsoft.com/office/drawing/2010/main" val="0"/>
+                        </a:ext>
+                      </a:extLst>
+                    </a:blip>
+                    <a:stretch>
+                      <a:fillRect/>
+                    </a:stretch>
+                  </pic:blipFill>
+                  <pic:spPr>
+                    <a:xfrm>
+                      <a:off x="0" y="0"/>
+                      <a:ext cx="1193703" cy="3047998"/>
+                    </a:xfrm>
+                    <a:prstGeom prst="rect">
+                      <a:avLst/>
+                    </a:prstGeom>
+                    <a:ln>
+                      <a:solidFill>
+                        <a:schemeClr val="tx1"/>
+                      </a:solidFill>
+                    </a:ln>
+                  </pic:spPr>
+                </pic:pic>
+              </a:graphicData>
+            </a:graphic>
+          </wp:anchor>
+        </w:drawing>
+      </w:r>
+      <w:r>
+        <w:rPr>
+          <w:rFonts w:ascii="Times New Roman" w:hAnsi="Times New Roman" w:cs="Times New Roman"/>
+          <w:i/>
+          <w:iCs/>
+          <w:noProof/>
+        </w:rPr>
         <mc:AlternateContent>
           <mc:Choice Requires="wps">
             <w:drawing>
-              <wp:anchor distT="0" distB="0" distL="114300" distR="114300" simplePos="0" relativeHeight="251659264" behindDoc="0" locked="0" layoutInCell="1" allowOverlap="1" wp14:anchorId="5C7AE029" wp14:editId="558A7EA7">
+              <wp:anchor distT="0" distB="0" distL="114300" distR="114300" simplePos="0" relativeHeight="251659264" behindDoc="0" locked="0" layoutInCell="1" allowOverlap="1" wp14:anchorId="5C7AE029" wp14:editId="6CC22CFA">
                 <wp:simplePos x="0" y="0"/>
                 <wp:positionH relativeFrom="column">
                   <wp:posOffset>2164080</wp:posOffset>
@@ -3904,15 +3869,7 @@
                                 <w:i/>
                                 <w:iCs/>
                               </w:rPr>
-                              <w:t xml:space="preserve"> – Add </w:t>
-                            </w:r>
-                            <w:r>
-                              <w:rPr>
-                                <w:rFonts w:ascii="Times New Roman" w:hAnsi="Times New Roman" w:cs="Times New Roman"/>
-                                <w:i/>
-                                <w:iCs/>
-                              </w:rPr>
-                              <w:t>Friend</w:t>
+                              <w:t xml:space="preserve"> – Add Friend</w:t>
                             </w:r>
                           </w:p>
                           <w:p/>
@@ -3977,15 +3934,7 @@
                           <w:i/>
                           <w:iCs/>
                         </w:rPr>
-                        <w:t xml:space="preserve"> – Add </w:t>
-                      </w:r>
-                      <w:r>
-                        <w:rPr>
-                          <w:rFonts w:ascii="Times New Roman" w:hAnsi="Times New Roman" w:cs="Times New Roman"/>
-                          <w:i/>
-                          <w:iCs/>
-                        </w:rPr>
-                        <w:t>Friend</w:t>
+                        <w:t xml:space="preserve"> – Add Friend</w:t>
                       </w:r>
                     </w:p>
                     <w:p/>
@@ -4004,18 +3953,10 @@
           <w:noProof/>
         </w:rPr>
         <w:drawing>
-          <wp:anchor distT="0" distB="0" distL="114300" distR="114300" simplePos="0" relativeHeight="251658240" behindDoc="0" locked="0" layoutInCell="1" allowOverlap="1" wp14:anchorId="774C61BA" wp14:editId="41D9B4D3">
-            <wp:simplePos x="0" y="0"/>
-            <wp:positionH relativeFrom="margin">
-              <wp:align>center</wp:align>
-            </wp:positionH>
-            <wp:positionV relativeFrom="margin">
-              <wp:posOffset>20424</wp:posOffset>
-            </wp:positionV>
-            <wp:extent cx="1193703" cy="3048000"/>
-            <wp:effectExtent l="19050" t="19050" r="26035" b="19050"/>
-            <wp:wrapSquare wrapText="bothSides"/>
-            <wp:docPr id="1855150672" name="Picture 5"/>
+          <wp:inline distT="0" distB="0" distL="0" distR="0" wp14:anchorId="6A2BBF34" wp14:editId="4FE7F64B">
+            <wp:extent cx="1140141" cy="3722447"/>
+            <wp:effectExtent l="19050" t="19050" r="22225" b="11430"/>
+            <wp:docPr id="1878481933" name="Picture 4"/>
             <wp:cNvGraphicFramePr>
               <a:graphicFrameLocks xmlns:a="http://schemas.openxmlformats.org/drawingml/2006/main" noChangeAspect="1"/>
             </wp:cNvGraphicFramePr>
@@ -4023,11 +3964,11 @@
               <a:graphicData uri="http://schemas.openxmlformats.org/drawingml/2006/picture">
                 <pic:pic xmlns:pic="http://schemas.openxmlformats.org/drawingml/2006/picture">
                   <pic:nvPicPr>
-                    <pic:cNvPr id="1855150672" name="Picture 1855150672"/>
+                    <pic:cNvPr id="1878481933" name="Picture 4"/>
                     <pic:cNvPicPr/>
                   </pic:nvPicPr>
                   <pic:blipFill>
-                    <a:blip r:embed="rId8">
+                    <a:blip r:embed="rId10" cstate="print">
                       <a:extLst>
                         <a:ext uri="{28A0092B-C50C-407E-A947-70E740481C1C}">
                           <a14:useLocalDpi xmlns:a14="http://schemas.microsoft.com/office/drawing/2010/main" val="0"/>
@@ -4041,61 +3982,7 @@
                   <pic:spPr>
                     <a:xfrm>
                       <a:off x="0" y="0"/>
-                      <a:ext cx="1193703" cy="3048000"/>
-                    </a:xfrm>
-                    <a:prstGeom prst="rect">
-                      <a:avLst/>
-                    </a:prstGeom>
-                    <a:ln>
-                      <a:solidFill>
-                        <a:schemeClr val="tx1"/>
-                      </a:solidFill>
-                    </a:ln>
-                  </pic:spPr>
-                </pic:pic>
-              </a:graphicData>
-            </a:graphic>
-          </wp:anchor>
-        </w:drawing>
-      </w:r>
-      <w:r>
-        <w:rPr>
-          <w:rFonts w:ascii="Times New Roman" w:hAnsi="Times New Roman" w:cs="Times New Roman"/>
-          <w:i/>
-          <w:iCs/>
-          <w:noProof/>
-        </w:rPr>
-        <w:drawing>
-          <wp:inline distT="0" distB="0" distL="0" distR="0" wp14:anchorId="6A2BBF34" wp14:editId="25DEDB9F">
-            <wp:extent cx="1135380" cy="3707051"/>
-            <wp:effectExtent l="19050" t="19050" r="26670" b="27305"/>
-            <wp:docPr id="1878481933" name="Picture 4"/>
-            <wp:cNvGraphicFramePr>
-              <a:graphicFrameLocks xmlns:a="http://schemas.openxmlformats.org/drawingml/2006/main" noChangeAspect="1"/>
-            </wp:cNvGraphicFramePr>
-            <a:graphic xmlns:a="http://schemas.openxmlformats.org/drawingml/2006/main">
-              <a:graphicData uri="http://schemas.openxmlformats.org/drawingml/2006/picture">
-                <pic:pic xmlns:pic="http://schemas.openxmlformats.org/drawingml/2006/picture">
-                  <pic:nvPicPr>
-                    <pic:cNvPr id="1878481933" name="Picture 1878481933"/>
-                    <pic:cNvPicPr/>
-                  </pic:nvPicPr>
-                  <pic:blipFill>
-                    <a:blip r:embed="rId9" cstate="print">
-                      <a:extLst>
-                        <a:ext uri="{28A0092B-C50C-407E-A947-70E740481C1C}">
-                          <a14:useLocalDpi xmlns:a14="http://schemas.microsoft.com/office/drawing/2010/main" val="0"/>
-                        </a:ext>
-                      </a:extLst>
-                    </a:blip>
-                    <a:stretch>
-                      <a:fillRect/>
-                    </a:stretch>
-                  </pic:blipFill>
-                  <pic:spPr>
-                    <a:xfrm>
-                      <a:off x="0" y="0"/>
-                      <a:ext cx="1140141" cy="3722597"/>
+                      <a:ext cx="1140141" cy="3722447"/>
                     </a:xfrm>
                     <a:prstGeom prst="rect">
                       <a:avLst/>
@@ -4129,19 +4016,16 @@
           <w:i/>
           <w:iCs/>
         </w:rPr>
-        <w:t>Fig 2 – Add User</w:t>
-      </w:r>
-    </w:p>
-    <w:p>
-      <w:pPr>
-        <w:spacing w:after="0" w:line="240" w:lineRule="auto"/>
-        <w:jc w:val="both"/>
+        <w:t xml:space="preserve"> </w:t>
+      </w:r>
+      <w:r>
         <w:rPr>
           <w:rFonts w:ascii="Times New Roman" w:hAnsi="Times New Roman" w:cs="Times New Roman"/>
           <w:i/>
           <w:iCs/>
         </w:rPr>
-      </w:pPr>
+        <w:t>Fig 2 – Add User</w:t>
+      </w:r>
     </w:p>
     <w:p>
       <w:pPr>
@@ -4153,6 +4037,71 @@
           <w:iCs/>
         </w:rPr>
       </w:pPr>
+    </w:p>
+    <w:p>
+      <w:pPr>
+        <w:spacing w:after="0" w:line="240" w:lineRule="auto"/>
+        <w:jc w:val="both"/>
+        <w:rPr>
+          <w:rFonts w:ascii="Times New Roman" w:hAnsi="Times New Roman" w:cs="Times New Roman"/>
+          <w:i/>
+          <w:iCs/>
+        </w:rPr>
+      </w:pPr>
+      <w:r>
+        <w:rPr>
+          <w:rFonts w:ascii="Times New Roman" w:hAnsi="Times New Roman" w:cs="Times New Roman"/>
+          <w:i/>
+          <w:iCs/>
+          <w:noProof/>
+        </w:rPr>
+        <w:drawing>
+          <wp:inline distT="0" distB="0" distL="0" distR="0" wp14:anchorId="30CB6C09" wp14:editId="18F37BFA">
+            <wp:extent cx="1558290" cy="4504055"/>
+            <wp:effectExtent l="19050" t="19050" r="22860" b="10795"/>
+            <wp:docPr id="84390896" name="Picture 8"/>
+            <wp:cNvGraphicFramePr>
+              <a:graphicFrameLocks xmlns:a="http://schemas.openxmlformats.org/drawingml/2006/main" noChangeAspect="1"/>
+            </wp:cNvGraphicFramePr>
+            <a:graphic xmlns:a="http://schemas.openxmlformats.org/drawingml/2006/main">
+              <a:graphicData uri="http://schemas.openxmlformats.org/drawingml/2006/picture">
+                <pic:pic xmlns:pic="http://schemas.openxmlformats.org/drawingml/2006/picture">
+                  <pic:nvPicPr>
+                    <pic:cNvPr id="84390896" name="Picture 8"/>
+                    <pic:cNvPicPr/>
+                  </pic:nvPicPr>
+                  <pic:blipFill>
+                    <a:blip r:embed="rId11" cstate="print">
+                      <a:extLst>
+                        <a:ext uri="{28A0092B-C50C-407E-A947-70E740481C1C}">
+                          <a14:useLocalDpi xmlns:a14="http://schemas.microsoft.com/office/drawing/2010/main" val="0"/>
+                        </a:ext>
+                      </a:extLst>
+                    </a:blip>
+                    <a:stretch>
+                      <a:fillRect/>
+                    </a:stretch>
+                  </pic:blipFill>
+                  <pic:spPr>
+                    <a:xfrm>
+                      <a:off x="0" y="0"/>
+                      <a:ext cx="1563224" cy="4518316"/>
+                    </a:xfrm>
+                    <a:prstGeom prst="rect">
+                      <a:avLst/>
+                    </a:prstGeom>
+                    <a:ln>
+                      <a:solidFill>
+                        <a:schemeClr val="tx1"/>
+                      </a:solidFill>
+                    </a:ln>
+                  </pic:spPr>
+                </pic:pic>
+              </a:graphicData>
+            </a:graphic>
+          </wp:inline>
+        </w:drawing>
+      </w:r>
       <w:r>
         <w:rPr>
           <w:rFonts w:ascii="Times New Roman" w:hAnsi="Times New Roman" w:cs="Times New Roman"/>
@@ -4302,6 +4251,52 @@
           </mc:Fallback>
         </mc:AlternateContent>
       </w:r>
+    </w:p>
+    <w:p>
+      <w:pPr>
+        <w:spacing w:after="0" w:line="240" w:lineRule="auto"/>
+        <w:jc w:val="both"/>
+        <w:rPr>
+          <w:rFonts w:ascii="Times New Roman" w:hAnsi="Times New Roman" w:cs="Times New Roman"/>
+          <w:i/>
+          <w:iCs/>
+        </w:rPr>
+      </w:pPr>
+      <w:r>
+        <w:rPr>
+          <w:rFonts w:ascii="Times New Roman" w:hAnsi="Times New Roman" w:cs="Times New Roman"/>
+          <w:i/>
+          <w:iCs/>
+        </w:rPr>
+        <w:t xml:space="preserve">Fig </w:t>
+      </w:r>
+      <w:r>
+        <w:rPr>
+          <w:rFonts w:ascii="Times New Roman" w:hAnsi="Times New Roman" w:cs="Times New Roman"/>
+          <w:i/>
+          <w:iCs/>
+        </w:rPr>
+        <w:t>5</w:t>
+      </w:r>
+      <w:r>
+        <w:rPr>
+          <w:rFonts w:ascii="Times New Roman" w:hAnsi="Times New Roman" w:cs="Times New Roman"/>
+          <w:i/>
+          <w:iCs/>
+        </w:rPr>
+        <w:t xml:space="preserve"> – Birthday of users in this month</w:t>
+      </w:r>
+    </w:p>
+    <w:p>
+      <w:pPr>
+        <w:spacing w:after="0" w:line="240" w:lineRule="auto"/>
+        <w:jc w:val="both"/>
+        <w:rPr>
+          <w:rFonts w:ascii="Times New Roman" w:hAnsi="Times New Roman" w:cs="Times New Roman"/>
+          <w:i/>
+          <w:iCs/>
+        </w:rPr>
+      </w:pPr>
       <w:r>
         <w:rPr>
           <w:rFonts w:ascii="Times New Roman" w:hAnsi="Times New Roman" w:cs="Times New Roman"/>
@@ -4310,169 +4305,7 @@
           <w:noProof/>
         </w:rPr>
         <w:drawing>
-          <wp:inline distT="0" distB="0" distL="0" distR="0" wp14:anchorId="5AC2C8C0" wp14:editId="01168525">
-            <wp:extent cx="1550670" cy="4417060"/>
-            <wp:effectExtent l="19050" t="19050" r="11430" b="21590"/>
-            <wp:docPr id="84390896" name="Picture 8"/>
-            <wp:cNvGraphicFramePr>
-              <a:graphicFrameLocks xmlns:a="http://schemas.openxmlformats.org/drawingml/2006/main" noChangeAspect="1"/>
-            </wp:cNvGraphicFramePr>
-            <a:graphic xmlns:a="http://schemas.openxmlformats.org/drawingml/2006/main">
-              <a:graphicData uri="http://schemas.openxmlformats.org/drawingml/2006/picture">
-                <pic:pic xmlns:pic="http://schemas.openxmlformats.org/drawingml/2006/picture">
-                  <pic:nvPicPr>
-                    <pic:cNvPr id="84390896" name="Picture 84390896"/>
-                    <pic:cNvPicPr/>
-                  </pic:nvPicPr>
-                  <pic:blipFill>
-                    <a:blip r:embed="rId10" cstate="print">
-                      <a:extLst>
-                        <a:ext uri="{28A0092B-C50C-407E-A947-70E740481C1C}">
-                          <a14:useLocalDpi xmlns:a14="http://schemas.microsoft.com/office/drawing/2010/main" val="0"/>
-                        </a:ext>
-                      </a:extLst>
-                    </a:blip>
-                    <a:stretch>
-                      <a:fillRect/>
-                    </a:stretch>
-                  </pic:blipFill>
-                  <pic:spPr>
-                    <a:xfrm>
-                      <a:off x="0" y="0"/>
-                      <a:ext cx="1555424" cy="4430602"/>
-                    </a:xfrm>
-                    <a:prstGeom prst="rect">
-                      <a:avLst/>
-                    </a:prstGeom>
-                    <a:ln>
-                      <a:solidFill>
-                        <a:schemeClr val="tx1"/>
-                      </a:solidFill>
-                    </a:ln>
-                  </pic:spPr>
-                </pic:pic>
-              </a:graphicData>
-            </a:graphic>
-          </wp:inline>
-        </w:drawing>
-      </w:r>
-    </w:p>
-    <w:p>
-      <w:pPr>
-        <w:spacing w:after="0" w:line="240" w:lineRule="auto"/>
-        <w:jc w:val="both"/>
-        <w:rPr>
-          <w:rFonts w:ascii="Times New Roman" w:hAnsi="Times New Roman" w:cs="Times New Roman"/>
-          <w:i/>
-          <w:iCs/>
-        </w:rPr>
-      </w:pPr>
-      <w:r>
-        <w:rPr>
-          <w:rFonts w:ascii="Times New Roman" w:hAnsi="Times New Roman" w:cs="Times New Roman"/>
-          <w:i/>
-          <w:iCs/>
-          <w:noProof/>
-        </w:rPr>
-        <w:drawing>
-          <wp:anchor distT="0" distB="0" distL="114300" distR="114300" simplePos="0" relativeHeight="251660288" behindDoc="0" locked="0" layoutInCell="1" allowOverlap="1" wp14:anchorId="51D3154C" wp14:editId="3A6D8E25">
-            <wp:simplePos x="933450" y="5033010"/>
-            <wp:positionH relativeFrom="margin">
-              <wp:align>right</wp:align>
-            </wp:positionH>
-            <wp:positionV relativeFrom="margin">
-              <wp:align>top</wp:align>
-            </wp:positionV>
-            <wp:extent cx="1611630" cy="4541995"/>
-            <wp:effectExtent l="19050" t="19050" r="26670" b="11430"/>
-            <wp:wrapSquare wrapText="bothSides"/>
-            <wp:docPr id="294443283" name="Picture 7"/>
-            <wp:cNvGraphicFramePr>
-              <a:graphicFrameLocks xmlns:a="http://schemas.openxmlformats.org/drawingml/2006/main" noChangeAspect="1"/>
-            </wp:cNvGraphicFramePr>
-            <a:graphic xmlns:a="http://schemas.openxmlformats.org/drawingml/2006/main">
-              <a:graphicData uri="http://schemas.openxmlformats.org/drawingml/2006/picture">
-                <pic:pic xmlns:pic="http://schemas.openxmlformats.org/drawingml/2006/picture">
-                  <pic:nvPicPr>
-                    <pic:cNvPr id="294443283" name="Picture 294443283"/>
-                    <pic:cNvPicPr/>
-                  </pic:nvPicPr>
-                  <pic:blipFill>
-                    <a:blip r:embed="rId11" cstate="print">
-                      <a:extLst>
-                        <a:ext uri="{28A0092B-C50C-407E-A947-70E740481C1C}">
-                          <a14:useLocalDpi xmlns:a14="http://schemas.microsoft.com/office/drawing/2010/main" val="0"/>
-                        </a:ext>
-                      </a:extLst>
-                    </a:blip>
-                    <a:stretch>
-                      <a:fillRect/>
-                    </a:stretch>
-                  </pic:blipFill>
-                  <pic:spPr>
-                    <a:xfrm>
-                      <a:off x="0" y="0"/>
-                      <a:ext cx="1611630" cy="4541995"/>
-                    </a:xfrm>
-                    <a:prstGeom prst="rect">
-                      <a:avLst/>
-                    </a:prstGeom>
-                    <a:ln>
-                      <a:solidFill>
-                        <a:schemeClr val="tx1"/>
-                      </a:solidFill>
-                    </a:ln>
-                  </pic:spPr>
-                </pic:pic>
-              </a:graphicData>
-            </a:graphic>
-          </wp:anchor>
-        </w:drawing>
-      </w:r>
-      <w:r>
-        <w:rPr>
-          <w:rFonts w:ascii="Times New Roman" w:hAnsi="Times New Roman" w:cs="Times New Roman"/>
-          <w:i/>
-          <w:iCs/>
-        </w:rPr>
-        <w:t xml:space="preserve">Fig </w:t>
-      </w:r>
-      <w:r>
-        <w:rPr>
-          <w:rFonts w:ascii="Times New Roman" w:hAnsi="Times New Roman" w:cs="Times New Roman"/>
-          <w:i/>
-          <w:iCs/>
-        </w:rPr>
-        <w:t>5</w:t>
-      </w:r>
-      <w:r>
-        <w:rPr>
-          <w:rFonts w:ascii="Times New Roman" w:hAnsi="Times New Roman" w:cs="Times New Roman"/>
-          <w:i/>
-          <w:iCs/>
-        </w:rPr>
-        <w:t xml:space="preserve"> – Birthday of users in this month</w:t>
-      </w:r>
-    </w:p>
-    <w:p>
-      <w:pPr>
-        <w:spacing w:after="0" w:line="240" w:lineRule="auto"/>
-        <w:jc w:val="both"/>
-        <w:rPr>
-          <w:rFonts w:ascii="Times New Roman" w:hAnsi="Times New Roman" w:cs="Times New Roman"/>
-          <w:i/>
-          <w:iCs/>
-        </w:rPr>
-      </w:pPr>
-      <w:r>
-        <w:rPr>
-          <w:rFonts w:ascii="Times New Roman" w:hAnsi="Times New Roman" w:cs="Times New Roman"/>
-          <w:i/>
-          <w:iCs/>
-          <w:noProof/>
-        </w:rPr>
-        <w:drawing>
-          <wp:anchor distT="0" distB="0" distL="114300" distR="114300" simplePos="0" relativeHeight="251663360" behindDoc="0" locked="0" layoutInCell="1" allowOverlap="1" wp14:anchorId="003B80BA" wp14:editId="361BE43E">
+          <wp:anchor distT="0" distB="0" distL="114300" distR="114300" simplePos="0" relativeHeight="251663360" behindDoc="0" locked="0" layoutInCell="1" allowOverlap="1" wp14:anchorId="003B80BA" wp14:editId="76BCEC29">
             <wp:simplePos x="0" y="0"/>
             <wp:positionH relativeFrom="margin">
               <wp:posOffset>3009900</wp:posOffset>
@@ -4480,8 +4313,8 @@
             <wp:positionV relativeFrom="margin">
               <wp:align>top</wp:align>
             </wp:positionV>
-            <wp:extent cx="2568575" cy="8359140"/>
-            <wp:effectExtent l="19050" t="19050" r="22225" b="22860"/>
+            <wp:extent cx="2567940" cy="8359140"/>
+            <wp:effectExtent l="19050" t="19050" r="22860" b="22860"/>
             <wp:wrapSquare wrapText="bothSides"/>
             <wp:docPr id="1465345442" name="Picture 10"/>
             <wp:cNvGraphicFramePr>
@@ -4491,7 +4324,7 @@
               <a:graphicData uri="http://schemas.openxmlformats.org/drawingml/2006/picture">
                 <pic:pic xmlns:pic="http://schemas.openxmlformats.org/drawingml/2006/picture">
                   <pic:nvPicPr>
-                    <pic:cNvPr id="1465345442" name="Picture 1465345442"/>
+                    <pic:cNvPr id="1465345442" name="Picture 10"/>
                     <pic:cNvPicPr/>
                   </pic:nvPicPr>
                   <pic:blipFill>
@@ -4509,7 +4342,7 @@
                   <pic:spPr>
                     <a:xfrm>
                       <a:off x="0" y="0"/>
-                      <a:ext cx="2568575" cy="8359140"/>
+                      <a:ext cx="2568483" cy="8359140"/>
                     </a:xfrm>
                     <a:prstGeom prst="rect">
                       <a:avLst/>
@@ -4540,9 +4373,9 @@
           <w:noProof/>
         </w:rPr>
         <w:drawing>
-          <wp:inline distT="0" distB="0" distL="0" distR="0" wp14:anchorId="012C9ED8" wp14:editId="77BED05A">
-            <wp:extent cx="2319734" cy="8351520"/>
-            <wp:effectExtent l="19050" t="19050" r="23495" b="11430"/>
+          <wp:inline distT="0" distB="0" distL="0" distR="0" wp14:anchorId="012C9ED8" wp14:editId="1AAD5BA9">
+            <wp:extent cx="2329166" cy="8386141"/>
+            <wp:effectExtent l="19050" t="19050" r="14605" b="15240"/>
             <wp:docPr id="1966582877" name="Picture 9"/>
             <wp:cNvGraphicFramePr>
               <a:graphicFrameLocks xmlns:a="http://schemas.openxmlformats.org/drawingml/2006/main" noChangeAspect="1"/>
@@ -4551,7 +4384,7 @@
               <a:graphicData uri="http://schemas.openxmlformats.org/drawingml/2006/picture">
                 <pic:pic xmlns:pic="http://schemas.openxmlformats.org/drawingml/2006/picture">
                   <pic:nvPicPr>
-                    <pic:cNvPr id="1966582877" name="Picture 1966582877"/>
+                    <pic:cNvPr id="1966582877" name="Picture 9"/>
                     <pic:cNvPicPr/>
                   </pic:nvPicPr>
                   <pic:blipFill>
@@ -4569,7 +4402,7 @@
                   <pic:spPr>
                     <a:xfrm>
                       <a:off x="0" y="0"/>
-                      <a:ext cx="2329350" cy="8386141"/>
+                      <a:ext cx="2329166" cy="8386141"/>
                     </a:xfrm>
                     <a:prstGeom prst="rect">
                       <a:avLst/>
@@ -4864,7 +4697,7 @@
           <w:szCs w:val="22"/>
         </w:rPr>
         <w:drawing>
-          <wp:anchor distT="0" distB="0" distL="114300" distR="114300" simplePos="0" relativeHeight="251666432" behindDoc="0" locked="0" layoutInCell="1" allowOverlap="1" wp14:anchorId="559C6E8E" wp14:editId="17CE8C0C">
+          <wp:anchor distT="0" distB="0" distL="114300" distR="114300" simplePos="0" relativeHeight="251666432" behindDoc="0" locked="0" layoutInCell="1" allowOverlap="1" wp14:anchorId="559C6E8E" wp14:editId="0C13865C">
             <wp:simplePos x="0" y="0"/>
             <wp:positionH relativeFrom="margin">
               <wp:posOffset>3114675</wp:posOffset>
@@ -4872,8 +4705,8 @@
             <wp:positionV relativeFrom="margin">
               <wp:align>top</wp:align>
             </wp:positionV>
-            <wp:extent cx="2616835" cy="8478520"/>
-            <wp:effectExtent l="19050" t="19050" r="12065" b="17780"/>
+            <wp:extent cx="2616835" cy="8476615"/>
+            <wp:effectExtent l="19050" t="19050" r="12065" b="19685"/>
             <wp:wrapSquare wrapText="bothSides"/>
             <wp:docPr id="354094748" name="Picture 14"/>
             <wp:cNvGraphicFramePr>
@@ -4883,7 +4716,7 @@
               <a:graphicData uri="http://schemas.openxmlformats.org/drawingml/2006/picture">
                 <pic:pic xmlns:pic="http://schemas.openxmlformats.org/drawingml/2006/picture">
                   <pic:nvPicPr>
-                    <pic:cNvPr id="354094748" name="Picture 354094748"/>
+                    <pic:cNvPr id="354094748" name="Picture 14"/>
                     <pic:cNvPicPr/>
                   </pic:nvPicPr>
                   <pic:blipFill>
@@ -4901,7 +4734,7 @@
                   <pic:spPr>
                     <a:xfrm>
                       <a:off x="0" y="0"/>
-                      <a:ext cx="2616835" cy="8478520"/>
+                      <a:ext cx="2616835" cy="8476928"/>
                     </a:xfrm>
                     <a:prstGeom prst="rect">
                       <a:avLst/>
@@ -4934,9 +4767,9 @@
           <w:szCs w:val="22"/>
         </w:rPr>
         <w:drawing>
-          <wp:inline distT="0" distB="0" distL="0" distR="0" wp14:anchorId="29870E8D" wp14:editId="1982D165">
-            <wp:extent cx="2308860" cy="8478576"/>
-            <wp:effectExtent l="19050" t="19050" r="15240" b="17780"/>
+          <wp:inline distT="0" distB="0" distL="0" distR="0" wp14:anchorId="29870E8D" wp14:editId="52BC6429">
+            <wp:extent cx="2313376" cy="8495388"/>
+            <wp:effectExtent l="19050" t="19050" r="10795" b="20320"/>
             <wp:docPr id="1791289617" name="Picture 12"/>
             <wp:cNvGraphicFramePr>
               <a:graphicFrameLocks xmlns:a="http://schemas.openxmlformats.org/drawingml/2006/main" noChangeAspect="1"/>
@@ -4945,7 +4778,7 @@
               <a:graphicData uri="http://schemas.openxmlformats.org/drawingml/2006/picture">
                 <pic:pic xmlns:pic="http://schemas.openxmlformats.org/drawingml/2006/picture">
                   <pic:nvPicPr>
-                    <pic:cNvPr id="1791289617" name="Picture 1791289617"/>
+                    <pic:cNvPr id="1791289617" name="Picture 12"/>
                     <pic:cNvPicPr/>
                   </pic:nvPicPr>
                   <pic:blipFill>
@@ -4963,7 +4796,7 @@
                   <pic:spPr>
                     <a:xfrm>
                       <a:off x="0" y="0"/>
-                      <a:ext cx="2313438" cy="8495388"/>
+                      <a:ext cx="2313376" cy="8495388"/>
                     </a:xfrm>
                     <a:prstGeom prst="rect">
                       <a:avLst/>
@@ -5013,15 +4846,7 @@
           <w:i/>
           <w:iCs/>
         </w:rPr>
-        <w:t xml:space="preserve"> – </w:t>
-      </w:r>
-      <w:r>
-        <w:rPr>
-          <w:rFonts w:ascii="Times New Roman" w:hAnsi="Times New Roman" w:cs="Times New Roman"/>
-          <w:i/>
-          <w:iCs/>
-        </w:rPr>
-        <w:t>Depth First Search (</w:t>
+        <w:t xml:space="preserve"> – Depth First Search (</w:t>
       </w:r>
       <w:proofErr w:type="gramStart"/>
       <w:r>
@@ -12230,6 +12055,7 @@
       <w:r>
         <w:rPr>
           <w:rFonts w:ascii="Times New Roman" w:hAnsi="Times New Roman" w:cs="Times New Roman"/>
+          <w:noProof/>
         </w:rPr>
         <w:drawing>
           <wp:inline distT="0" distB="0" distL="0" distR="0" wp14:anchorId="288C21F0" wp14:editId="3025EB03">
@@ -12303,6 +12129,7 @@
       <w:r>
         <w:rPr>
           <w:rFonts w:ascii="Times New Roman" w:hAnsi="Times New Roman" w:cs="Times New Roman"/>
+          <w:noProof/>
         </w:rPr>
         <w:drawing>
           <wp:inline distT="0" distB="0" distL="0" distR="0" wp14:anchorId="7DD811A3" wp14:editId="41B00B72">
@@ -12376,6 +12203,7 @@
       <w:r>
         <w:rPr>
           <w:rFonts w:ascii="Times New Roman" w:hAnsi="Times New Roman" w:cs="Times New Roman"/>
+          <w:noProof/>
         </w:rPr>
         <w:drawing>
           <wp:inline distT="0" distB="0" distL="0" distR="0" wp14:anchorId="49F26886" wp14:editId="15727911">
@@ -12449,6 +12277,7 @@
       <w:r>
         <w:rPr>
           <w:rFonts w:ascii="Times New Roman" w:hAnsi="Times New Roman" w:cs="Times New Roman"/>
+          <w:noProof/>
         </w:rPr>
         <w:drawing>
           <wp:inline distT="0" distB="0" distL="0" distR="0" wp14:anchorId="1573A6D8" wp14:editId="12FEFBF5">
@@ -12522,6 +12351,7 @@
       <w:r>
         <w:rPr>
           <w:rFonts w:ascii="Times New Roman" w:hAnsi="Times New Roman" w:cs="Times New Roman"/>
+          <w:noProof/>
         </w:rPr>
         <w:drawing>
           <wp:inline distT="0" distB="0" distL="0" distR="0" wp14:anchorId="7141640B" wp14:editId="01BD6A1C">
@@ -12595,6 +12425,7 @@
       <w:r>
         <w:rPr>
           <w:rFonts w:ascii="Times New Roman" w:hAnsi="Times New Roman" w:cs="Times New Roman"/>
+          <w:noProof/>
         </w:rPr>
         <w:drawing>
           <wp:inline distT="0" distB="0" distL="0" distR="0" wp14:anchorId="6A9DABF0" wp14:editId="6D63F664">
@@ -17364,6 +17195,7 @@
   <w:style w:type="character" w:default="1" w:styleId="DefaultParagraphFont">
     <w:name w:val="Default Paragraph Font"/>
     <w:uiPriority w:val="1"/>
+    <w:semiHidden/>
     <w:unhideWhenUsed/>
   </w:style>
   <w:style w:type="table" w:default="1" w:styleId="TableNormal">
@@ -17941,6 +17773,7 @@
     <w:rsidRoot w:val="00F9235E"/>
     <w:rsid w:val="0011164F"/>
     <w:rsid w:val="001A4C2D"/>
+    <w:rsid w:val="002C6AB8"/>
     <w:rsid w:val="003016DA"/>
     <w:rsid w:val="00343052"/>
     <w:rsid w:val="0035708B"/>
@@ -17951,6 +17784,7 @@
     <w:rsid w:val="004F6BA9"/>
     <w:rsid w:val="00576D03"/>
     <w:rsid w:val="0083481E"/>
+    <w:rsid w:val="009863C4"/>
     <w:rsid w:val="009F12C8"/>
     <w:rsid w:val="00A1159E"/>
     <w:rsid w:val="00A963A1"/>

</xml_diff>